<commit_message>
feat(reel,brand): outro QR hold 4s + landscape header icon 36dp
reel-outro-hold-and-brand-icon-size — 3 changes, verified vs live source first,
compileDebugKotlin passed, no deviations. Brief → docs/DONE/.

- AdventureReelEncoder.kt: OUTRO_HOLD_FRAMES 45 -> 120 (1.5s -> 4s) so the QR
  end-card holds long enough to scan before the clip loops. Constant feeds both
  the hold loop and the total-length calc; reel grows ~2.5s as intended.
- MacacoBrandBlock.kt: landscape collapsedIconSize 28.dp -> 36.dp (shared
  Journal/Map/Profile compact headers).
- EntryDetailScreen.kt: hand-rolled header icon 28.dp -> 36.dp to match #2 (the
  one header not routed through MacacoBrandBlock). Dedup left as future brief.

Co-Authored-By: Claude Opus 4.8 <noreply@anthropic.com>
</commit_message>
<xml_diff>
--- a/Macaco-Play-Listing-ASO-2026-07.docx
+++ b/Macaco-Play-Listing-ASO-2026-07.docx
@@ -32,6 +32,22 @@
       </w:pPr>
       <w:r>
         <w:t xml:space="preserve">What changed in this revision</w:t>
+      </w:r>
+    </w:p>
+    <w:p>
+      <w:pPr>
+        <w:spacing w:after="40"/>
+      </w:pPr>
+      <w:r>
+        <w:t xml:space="preserve">• Policy compliance: short descriptions rewritten without price/promotional keywords (“no ads” etc.) per Google Play metadata policy — promotion was flagged by Play. Privacy is now conveyed via feature terms only (private, app lock). The no-ads message remains in the full description, where it is permitted.</w:t>
+      </w:r>
+    </w:p>
+    <w:p>
+      <w:pPr>
+        <w:spacing w:after="40"/>
+      </w:pPr>
+      <w:r>
+        <w:t xml:space="preserve">• Adventure Reel added as its own section in all languages: one tap turns a trip’s photos into a shareable vertical mini-movie (pan-and-zoom, transitions, location/date overlays) — also added to the Premium list.</w:t>
       </w:r>
     </w:p>
     <w:p>
@@ -142,7 +158,7 @@
         <w:spacing w:after="40"/>
       </w:pPr>
       <w:r>
-        <w:t xml:space="preserve">Private travel journal: photos, videos, map &amp; cloud sync. No ads, data yours.</w:t>
+        <w:t xml:space="preserve">Private travel journal: photos, videos, adventures map, cloud sync, app lock.</w:t>
       </w:r>
     </w:p>
     <w:p>
@@ -157,7 +173,7 @@
           <w:sz w:val="20"/>
           <w:szCs w:val="20"/>
         </w:rPr>
-        <w:t xml:space="preserve">FULL DESCRIPTION (2326/4000)</w:t>
+        <w:t xml:space="preserve">FULL DESCRIPTION (2643/4000)</w:t>
       </w:r>
     </w:p>
     <w:p>
@@ -237,6 +253,30 @@
         <w:spacing w:after="40"/>
       </w:pPr>
       <w:r>
+        <w:t xml:space="preserve">🎞️ THE ADVENTURE REEL</w:t>
+      </w:r>
+    </w:p>
+    <w:p>
+      <w:pPr>
+        <w:spacing w:after="40"/>
+      </w:pPr>
+      <w:r>
+        <w:t xml:space="preserve">Turn any trip into a shareable mini-movie. One tap builds a beautiful vertical slideshow from your trip photos — smooth pan-and-zoom, elegant transitions, location and date overlays — ready for WhatsApp, Instagram or the family group chat.</w:t>
+      </w:r>
+    </w:p>
+    <w:p>
+      <w:pPr>
+        <w:spacing w:after="40"/>
+      </w:pPr>
+      <w:r>
+        <w:t xml:space="preserve"> </w:t>
+      </w:r>
+    </w:p>
+    <w:p>
+      <w:pPr>
+        <w:spacing w:after="40"/>
+      </w:pPr>
+      <w:r>
         <w:t xml:space="preserve">✍️ CAPTURE EVERY TRIP</w:t>
       </w:r>
     </w:p>
@@ -438,6 +478,14 @@
       </w:pPr>
       <w:r>
         <w:t xml:space="preserve">🎬 Up to 3 videos (15 s) per entry</w:t>
+      </w:r>
+    </w:p>
+    <w:p>
+      <w:pPr>
+        <w:spacing w:after="40"/>
+      </w:pPr>
+      <w:r>
+        <w:t xml:space="preserve">🎞️ Adventure Reels — turn trips into shareable videos</w:t>
       </w:r>
     </w:p>
     <w:p>
@@ -548,15 +596,15 @@
           <w:sz w:val="20"/>
           <w:szCs w:val="20"/>
         </w:rPr>
-        <w:t xml:space="preserve">SHORT DESCRIPTION (72/80)</w:t>
-      </w:r>
-    </w:p>
-    <w:p>
-      <w:pPr>
-        <w:spacing w:after="40"/>
-      </w:pPr>
-      <w:r>
-        <w:t xml:space="preserve">Privates Reisetagebuch: Fotos, Videos, Karte &amp; Cloud-Sync. Ohne Werbung.</w:t>
+        <w:t xml:space="preserve">SHORT DESCRIPTION (70/80)</w:t>
+      </w:r>
+    </w:p>
+    <w:p>
+      <w:pPr>
+        <w:spacing w:after="40"/>
+      </w:pPr>
+      <w:r>
+        <w:t xml:space="preserve">Privates Reisetagebuch: Fotos, Videos, Karte, Cloud-Sync &amp; App-Sperre.</w:t>
       </w:r>
     </w:p>
     <w:p>
@@ -571,7 +619,7 @@
           <w:sz w:val="20"/>
           <w:szCs w:val="20"/>
         </w:rPr>
-        <w:t xml:space="preserve">FULL DESCRIPTION (2672/4000)</w:t>
+        <w:t xml:space="preserve">FULL DESCRIPTION (2999/4000)</w:t>
       </w:r>
     </w:p>
     <w:p>
@@ -651,6 +699,30 @@
         <w:spacing w:after="40"/>
       </w:pPr>
       <w:r>
+        <w:t xml:space="preserve">🎞️ DAS ABENTEUER-REEL</w:t>
+      </w:r>
+    </w:p>
+    <w:p>
+      <w:pPr>
+        <w:spacing w:after="40"/>
+      </w:pPr>
+      <w:r>
+        <w:t xml:space="preserve">Mach aus jeder Reise einen teilbaren Mini-Film. Ein Tipp erstellt eine wunderschöne vertikale Slideshow aus deinen Reisefotos — sanfte Kamerafahrten, elegante Übergänge, Orts- und Datumseinblendungen — bereit für WhatsApp, Instagram oder den Familienchat.</w:t>
+      </w:r>
+    </w:p>
+    <w:p>
+      <w:pPr>
+        <w:spacing w:after="40"/>
+      </w:pPr>
+      <w:r>
+        <w:t xml:space="preserve"> </w:t>
+      </w:r>
+    </w:p>
+    <w:p>
+      <w:pPr>
+        <w:spacing w:after="40"/>
+      </w:pPr>
+      <w:r>
         <w:t xml:space="preserve">✍️ HALTE JEDE REISE FEST</w:t>
       </w:r>
     </w:p>
@@ -852,6 +924,14 @@
       </w:pPr>
       <w:r>
         <w:t xml:space="preserve">🎬 Bis zu 3 Videos (15 Sek.) pro Eintrag</w:t>
+      </w:r>
+    </w:p>
+    <w:p>
+      <w:pPr>
+        <w:spacing w:after="40"/>
+      </w:pPr>
+      <w:r>
+        <w:t xml:space="preserve">🎞️ Abenteuer-Reels — Reisen als teilbare Videos</w:t>
       </w:r>
     </w:p>
     <w:p>
@@ -962,15 +1042,15 @@
           <w:sz w:val="20"/>
           <w:szCs w:val="20"/>
         </w:rPr>
-        <w:t xml:space="preserve">SHORT DESCRIPTION (77/80)</w:t>
-      </w:r>
-    </w:p>
-    <w:p>
-      <w:pPr>
-        <w:spacing w:after="40"/>
-      </w:pPr>
-      <w:r>
-        <w:t xml:space="preserve">Diario de viaje privado: fotos, vídeos, mapa y nube. Sin anuncios ni rastreo.</w:t>
+        <w:t xml:space="preserve">SHORT DESCRIPTION (68/80)</w:t>
+      </w:r>
+    </w:p>
+    <w:p>
+      <w:pPr>
+        <w:spacing w:after="40"/>
+      </w:pPr>
+      <w:r>
+        <w:t xml:space="preserve">Diario de viaje privado: fotos, vídeos, mapa, nube y bloqueo de app.</w:t>
       </w:r>
     </w:p>
     <w:p>
@@ -985,7 +1065,7 @@
           <w:sz w:val="20"/>
           <w:szCs w:val="20"/>
         </w:rPr>
-        <w:t xml:space="preserve">FULL DESCRIPTION (2524/4000)</w:t>
+        <w:t xml:space="preserve">FULL DESCRIPTION (2886/4000)</w:t>
       </w:r>
     </w:p>
     <w:p>
@@ -1065,6 +1145,30 @@
         <w:spacing w:after="40"/>
       </w:pPr>
       <w:r>
+        <w:t xml:space="preserve">🎞️ EL REEL DE AVENTURAS</w:t>
+      </w:r>
+    </w:p>
+    <w:p>
+      <w:pPr>
+        <w:spacing w:after="40"/>
+      </w:pPr>
+      <w:r>
+        <w:t xml:space="preserve">Convierte cualquier viaje en una mini-película para compartir. Con un toque se crea una preciosa presentación vertical con las fotos de tu viaje — movimientos suaves, transiciones elegantes, lugar y fecha superpuestos — lista para WhatsApp, Instagram o el chat familiar.</w:t>
+      </w:r>
+    </w:p>
+    <w:p>
+      <w:pPr>
+        <w:spacing w:after="40"/>
+      </w:pPr>
+      <w:r>
+        <w:t xml:space="preserve"> </w:t>
+      </w:r>
+    </w:p>
+    <w:p>
+      <w:pPr>
+        <w:spacing w:after="40"/>
+      </w:pPr>
+      <w:r>
         <w:t xml:space="preserve">✍️ CAPTURA CADA VIAJE</w:t>
       </w:r>
     </w:p>
@@ -1266,6 +1370,14 @@
       </w:pPr>
       <w:r>
         <w:t xml:space="preserve">🎬 Hasta 3 vídeos (15 s) por entrada</w:t>
+      </w:r>
+    </w:p>
+    <w:p>
+      <w:pPr>
+        <w:spacing w:after="40"/>
+      </w:pPr>
+      <w:r>
+        <w:t xml:space="preserve">🎞️ Reels de aventuras — convierte viajes en vídeos para compartir</w:t>
       </w:r>
     </w:p>
     <w:p>
@@ -1376,15 +1488,15 @@
           <w:sz w:val="20"/>
           <w:szCs w:val="20"/>
         </w:rPr>
-        <w:t xml:space="preserve">SHORT DESCRIPTION (73/80)</w:t>
-      </w:r>
-    </w:p>
-    <w:p>
-      <w:pPr>
-        <w:spacing w:after="40"/>
-      </w:pPr>
-      <w:r>
-        <w:t xml:space="preserve">Journal de voyage privé : photos, vidéos, carte, synchro cloud. Zéro pub.</w:t>
+        <w:t xml:space="preserve">SHORT DESCRIPTION (77/80)</w:t>
+      </w:r>
+    </w:p>
+    <w:p>
+      <w:pPr>
+        <w:spacing w:after="40"/>
+      </w:pPr>
+      <w:r>
+        <w:t xml:space="preserve">Journal de voyage privé : photos, vidéos, carte, synchro cloud, verrouillage.</w:t>
       </w:r>
     </w:p>
     <w:p>
@@ -1399,7 +1511,7 @@
           <w:sz w:val="20"/>
           <w:szCs w:val="20"/>
         </w:rPr>
-        <w:t xml:space="preserve">FULL DESCRIPTION (2846/4000)</w:t>
+        <w:t xml:space="preserve">FULL DESCRIPTION (3202/4000)</w:t>
       </w:r>
     </w:p>
     <w:p>
@@ -1479,6 +1591,30 @@
         <w:spacing w:after="40"/>
       </w:pPr>
       <w:r>
+        <w:t xml:space="preserve">🎞️ LE REEL D'AVENTURES</w:t>
+      </w:r>
+    </w:p>
+    <w:p>
+      <w:pPr>
+        <w:spacing w:after="40"/>
+      </w:pPr>
+      <w:r>
+        <w:t xml:space="preserve">Transformez n'importe quel voyage en mini-film à partager. Un seul geste crée un magnifique diaporama vertical à partir de vos photos de voyage — panoramiques fluides, transitions élégantes, lieu et date en surimpression — prêt pour WhatsApp, Instagram ou le groupe familial.</w:t>
+      </w:r>
+    </w:p>
+    <w:p>
+      <w:pPr>
+        <w:spacing w:after="40"/>
+      </w:pPr>
+      <w:r>
+        <w:t xml:space="preserve"> </w:t>
+      </w:r>
+    </w:p>
+    <w:p>
+      <w:pPr>
+        <w:spacing w:after="40"/>
+      </w:pPr>
+      <w:r>
         <w:t xml:space="preserve">✍️ CAPTUREZ CHAQUE VOYAGE</w:t>
       </w:r>
     </w:p>
@@ -1680,6 +1816,14 @@
       </w:pPr>
       <w:r>
         <w:t xml:space="preserve">🎬 Jusqu'à 3 vidéos (15 s) par entrée</w:t>
+      </w:r>
+    </w:p>
+    <w:p>
+      <w:pPr>
+        <w:spacing w:after="40"/>
+      </w:pPr>
+      <w:r>
+        <w:t xml:space="preserve">🎞️ Reels d'aventures — vos voyages en vidéos à partager</w:t>
       </w:r>
     </w:p>
     <w:p>
@@ -1790,15 +1934,15 @@
           <w:sz w:val="20"/>
           <w:szCs w:val="20"/>
         </w:rPr>
-        <w:t xml:space="preserve">SHORT DESCRIPTION (71/80)</w:t>
-      </w:r>
-    </w:p>
-    <w:p>
-      <w:pPr>
-        <w:spacing w:after="40"/>
-      </w:pPr>
-      <w:r>
-        <w:t xml:space="preserve">Diario di viaggio privato: foto, video, mappa e cloud. Zero pubblicità.</w:t>
+        <w:t xml:space="preserve">SHORT DESCRIPTION (66/80)</w:t>
+      </w:r>
+    </w:p>
+    <w:p>
+      <w:pPr>
+        <w:spacing w:after="40"/>
+      </w:pPr>
+      <w:r>
+        <w:t xml:space="preserve">Diario di viaggio privato: foto, video, mappa, cloud e blocco app.</w:t>
       </w:r>
     </w:p>
     <w:p>
@@ -1813,7 +1957,7 @@
           <w:sz w:val="20"/>
           <w:szCs w:val="20"/>
         </w:rPr>
-        <w:t xml:space="preserve">FULL DESCRIPTION (2605/4000)</w:t>
+        <w:t xml:space="preserve">FULL DESCRIPTION (2968/4000)</w:t>
       </w:r>
     </w:p>
     <w:p>
@@ -1893,6 +2037,30 @@
         <w:spacing w:after="40"/>
       </w:pPr>
       <w:r>
+        <w:t xml:space="preserve">🎞️ IL REEL DELLE AVVENTURE</w:t>
+      </w:r>
+    </w:p>
+    <w:p>
+      <w:pPr>
+        <w:spacing w:after="40"/>
+      </w:pPr>
+      <w:r>
+        <w:t xml:space="preserve">Trasforma qualsiasi viaggio in un mini-film da condividere. Con un tocco crei una splendida presentazione verticale dalle foto del viaggio — panoramiche fluide, transizioni eleganti, luogo e data in sovrimpressione — pronta per WhatsApp, Instagram o la chat di famiglia.</w:t>
+      </w:r>
+    </w:p>
+    <w:p>
+      <w:pPr>
+        <w:spacing w:after="40"/>
+      </w:pPr>
+      <w:r>
+        <w:t xml:space="preserve"> </w:t>
+      </w:r>
+    </w:p>
+    <w:p>
+      <w:pPr>
+        <w:spacing w:after="40"/>
+      </w:pPr>
+      <w:r>
         <w:t xml:space="preserve">✍️ CATTURA OGNI VIAGGIO</w:t>
       </w:r>
     </w:p>
@@ -2094,6 +2262,14 @@
       </w:pPr>
       <w:r>
         <w:t xml:space="preserve">🎬 Fino a 3 video (15 s) per voce</w:t>
+      </w:r>
+    </w:p>
+    <w:p>
+      <w:pPr>
+        <w:spacing w:after="40"/>
+      </w:pPr>
+      <w:r>
+        <w:t xml:space="preserve">🎞️ Reel delle avventure — i tuoi viaggi in video da condividere</w:t>
       </w:r>
     </w:p>
     <w:p>
@@ -2204,15 +2380,15 @@
           <w:sz w:val="20"/>
           <w:szCs w:val="20"/>
         </w:rPr>
-        <w:t xml:space="preserve">SHORT DESCRIPTION (33/80)</w:t>
-      </w:r>
-    </w:p>
-    <w:p>
-      <w:pPr>
-        <w:spacing w:after="40"/>
-      </w:pPr>
-      <w:r>
-        <w:t xml:space="preserve">プライベートな旅行日記：写真・動画・地図・クラウド同期。広告なし。</w:t>
+        <w:t xml:space="preserve">SHORT DESCRIPTION (35/80)</w:t>
+      </w:r>
+    </w:p>
+    <w:p>
+      <w:pPr>
+        <w:spacing w:after="40"/>
+      </w:pPr>
+      <w:r>
+        <w:t xml:space="preserve">プライベートな旅行日記：写真・動画・地図・クラウド同期・アプリロック。</w:t>
       </w:r>
     </w:p>
     <w:p>
@@ -2227,7 +2403,7 @@
           <w:sz w:val="20"/>
           <w:szCs w:val="20"/>
         </w:rPr>
-        <w:t xml:space="preserve">FULL DESCRIPTION (1256/4000)</w:t>
+        <w:t xml:space="preserve">FULL DESCRIPTION (1429/4000)</w:t>
       </w:r>
     </w:p>
     <w:p>
@@ -2307,6 +2483,30 @@
         <w:spacing w:after="40"/>
       </w:pPr>
       <w:r>
+        <w:t xml:space="preserve">🎞️ アドベンチャーリール</w:t>
+      </w:r>
+    </w:p>
+    <w:p>
+      <w:pPr>
+        <w:spacing w:after="40"/>
+      </w:pPr>
+      <w:r>
+        <w:t xml:space="preserve">どんな旅も、シェアできるミニムービーに。ワンタップで旅の写真から美しい縦型スライドショーを作成 — なめらかなパン＆ズーム、上品なトランジション、場所と日付のオーバーレイ付き。WhatsApp や Instagram、家族のグループチャットにそのままどうぞ。</w:t>
+      </w:r>
+    </w:p>
+    <w:p>
+      <w:pPr>
+        <w:spacing w:after="40"/>
+      </w:pPr>
+      <w:r>
+        <w:t xml:space="preserve"> </w:t>
+      </w:r>
+    </w:p>
+    <w:p>
+      <w:pPr>
+        <w:spacing w:after="40"/>
+      </w:pPr>
+      <w:r>
         <w:t xml:space="preserve">✍️ すべての旅を記録</w:t>
       </w:r>
     </w:p>
@@ -2508,6 +2708,14 @@
       </w:pPr>
       <w:r>
         <w:t xml:space="preserve">🎬 エントリごとに最大 3 本の動画（15 秒）</w:t>
+      </w:r>
+    </w:p>
+    <w:p>
+      <w:pPr>
+        <w:spacing w:after="40"/>
+      </w:pPr>
+      <w:r>
+        <w:t xml:space="preserve">🎞️ アドベンチャーリール — 旅をシェアできる動画に</w:t>
       </w:r>
     </w:p>
     <w:p>
@@ -2618,15 +2826,15 @@
           <w:sz w:val="20"/>
           <w:szCs w:val="20"/>
         </w:rPr>
-        <w:t xml:space="preserve">SHORT DESCRIPTION (74/80)</w:t>
-      </w:r>
-    </w:p>
-    <w:p>
-      <w:pPr>
-        <w:spacing w:after="40"/>
-      </w:pPr>
-      <w:r>
-        <w:t xml:space="preserve">Privé reisdagboek: foto's, video's, kaart &amp; cloud-sync. Geen advertenties.</w:t>
+        <w:t xml:space="preserve">SHORT DESCRIPTION (75/80)</w:t>
+      </w:r>
+    </w:p>
+    <w:p>
+      <w:pPr>
+        <w:spacing w:after="40"/>
+      </w:pPr>
+      <w:r>
+        <w:t xml:space="preserve">Privé reisdagboek: foto's, video's, kaart, cloud-sync en app-vergrendeling.</w:t>
       </w:r>
     </w:p>
     <w:p>
@@ -2641,7 +2849,7 @@
           <w:sz w:val="20"/>
           <w:szCs w:val="20"/>
         </w:rPr>
-        <w:t xml:space="preserve">FULL DESCRIPTION (2543/4000)</w:t>
+        <w:t xml:space="preserve">FULL DESCRIPTION (2859/4000)</w:t>
       </w:r>
     </w:p>
     <w:p>
@@ -2721,6 +2929,30 @@
         <w:spacing w:after="40"/>
       </w:pPr>
       <w:r>
+        <w:t xml:space="preserve">🎞️ DE AVONTURENREEL</w:t>
+      </w:r>
+    </w:p>
+    <w:p>
+      <w:pPr>
+        <w:spacing w:after="40"/>
+      </w:pPr>
+      <w:r>
+        <w:t xml:space="preserve">Maak van elke reis een deelbare minifilm. Met één tik bouw je een prachtige verticale slideshow van je reisfoto's — vloeiend pannen en zoomen, elegante overgangen, locatie en datum in beeld — klaar voor WhatsApp, Instagram of de familie-appgroep.</w:t>
+      </w:r>
+    </w:p>
+    <w:p>
+      <w:pPr>
+        <w:spacing w:after="40"/>
+      </w:pPr>
+      <w:r>
+        <w:t xml:space="preserve"> </w:t>
+      </w:r>
+    </w:p>
+    <w:p>
+      <w:pPr>
+        <w:spacing w:after="40"/>
+      </w:pPr>
+      <w:r>
         <w:t xml:space="preserve">✍️ LEG ELKE REIS VAST</w:t>
       </w:r>
     </w:p>
@@ -2922,6 +3154,14 @@
       </w:pPr>
       <w:r>
         <w:t xml:space="preserve">🎬 Tot 3 video's (15 s) per item</w:t>
+      </w:r>
+    </w:p>
+    <w:p>
+      <w:pPr>
+        <w:spacing w:after="40"/>
+      </w:pPr>
+      <w:r>
+        <w:t xml:space="preserve">🎞️ Avonturenreels — reizen als deelbare video's</w:t>
       </w:r>
     </w:p>
     <w:p>
@@ -3032,15 +3272,15 @@
           <w:sz w:val="20"/>
           <w:szCs w:val="20"/>
         </w:rPr>
-        <w:t xml:space="preserve">SHORT DESCRIPTION (80/80)</w:t>
-      </w:r>
-    </w:p>
-    <w:p>
-      <w:pPr>
-        <w:spacing w:after="40"/>
-      </w:pPr>
-      <w:r>
-        <w:t xml:space="preserve">Prywatny dziennik podróży: zdjęcia, filmy, mapa, chmura. Bez reklam i śledzenia.</w:t>
+        <w:t xml:space="preserve">SHORT DESCRIPTION (76/80)</w:t>
+      </w:r>
+    </w:p>
+    <w:p>
+      <w:pPr>
+        <w:spacing w:after="40"/>
+      </w:pPr>
+      <w:r>
+        <w:t xml:space="preserve">Prywatny dziennik podróży: zdjęcia, filmy, mapa, chmura i blokada aplikacji.</w:t>
       </w:r>
     </w:p>
     <w:p>
@@ -3055,7 +3295,7 @@
           <w:sz w:val="20"/>
           <w:szCs w:val="20"/>
         </w:rPr>
-        <w:t xml:space="preserve">FULL DESCRIPTION (2633/4000)</w:t>
+        <w:t xml:space="preserve">FULL DESCRIPTION (2955/4000)</w:t>
       </w:r>
     </w:p>
     <w:p>
@@ -3135,6 +3375,30 @@
         <w:spacing w:after="40"/>
       </w:pPr>
       <w:r>
+        <w:t xml:space="preserve">🎞️ ROLKA PRZYGÓD</w:t>
+      </w:r>
+    </w:p>
+    <w:p>
+      <w:pPr>
+        <w:spacing w:after="40"/>
+      </w:pPr>
+      <w:r>
+        <w:t xml:space="preserve">Zamień każdą podróż w mini-film do udostępnienia. Jedno dotknięcie tworzy piękny pionowy pokaz slajdów ze zdjęć z podróży — płynne najazdy kamery, eleganckie przejścia, miejsce i data na ekranie — gotowy na WhatsAppa, Instagrama albo rodzinny czat.</w:t>
+      </w:r>
+    </w:p>
+    <w:p>
+      <w:pPr>
+        <w:spacing w:after="40"/>
+      </w:pPr>
+      <w:r>
+        <w:t xml:space="preserve"> </w:t>
+      </w:r>
+    </w:p>
+    <w:p>
+      <w:pPr>
+        <w:spacing w:after="40"/>
+      </w:pPr>
+      <w:r>
         <w:t xml:space="preserve">✍️ UCHWYĆ KAŻDĄ PODRÓŻ</w:t>
       </w:r>
     </w:p>
@@ -3336,6 +3600,14 @@
       </w:pPr>
       <w:r>
         <w:t xml:space="preserve">🎬 Do 3 filmów (15 s) na wpis</w:t>
+      </w:r>
+    </w:p>
+    <w:p>
+      <w:pPr>
+        <w:spacing w:after="40"/>
+      </w:pPr>
+      <w:r>
+        <w:t xml:space="preserve">🎞️ Rolki przygód — podróże jako filmy do udostępnienia</w:t>
       </w:r>
     </w:p>
     <w:p>
@@ -3446,15 +3718,15 @@
           <w:sz w:val="20"/>
           <w:szCs w:val="20"/>
         </w:rPr>
-        <w:t xml:space="preserve">SHORT DESCRIPTION (68/80)</w:t>
-      </w:r>
-    </w:p>
-    <w:p>
-      <w:pPr>
-        <w:spacing w:after="40"/>
-      </w:pPr>
-      <w:r>
-        <w:t xml:space="preserve">Diário de viagem privado: fotos, vídeos, mapa e nuvem. Sem anúncios.</w:t>
+        <w:t xml:space="preserve">SHORT DESCRIPTION (77/80)</w:t>
+      </w:r>
+    </w:p>
+    <w:p>
+      <w:pPr>
+        <w:spacing w:after="40"/>
+      </w:pPr>
+      <w:r>
+        <w:t xml:space="preserve">Diário de viagem privado: fotos, vídeos, mapa, nuvem e bloqueio de aplicação.</w:t>
       </w:r>
     </w:p>
     <w:p>
@@ -3469,7 +3741,7 @@
           <w:sz w:val="20"/>
           <w:szCs w:val="20"/>
         </w:rPr>
-        <w:t xml:space="preserve">FULL DESCRIPTION (2583/4000)</w:t>
+        <w:t xml:space="preserve">FULL DESCRIPTION (2923/4000)</w:t>
       </w:r>
     </w:p>
     <w:p>
@@ -3549,6 +3821,30 @@
         <w:spacing w:after="40"/>
       </w:pPr>
       <w:r>
+        <w:t xml:space="preserve">🎞️ O REEL DE AVENTURAS</w:t>
+      </w:r>
+    </w:p>
+    <w:p>
+      <w:pPr>
+        <w:spacing w:after="40"/>
+      </w:pPr>
+      <w:r>
+        <w:t xml:space="preserve">Transforme qualquer viagem num mini-filme para partilhar. Um toque cria uma bela apresentação vertical com as fotos da sua viagem — movimentos suaves, transições elegantes, local e data sobrepostos — pronta para o WhatsApp, o Instagram ou o grupo da família.</w:t>
+      </w:r>
+    </w:p>
+    <w:p>
+      <w:pPr>
+        <w:spacing w:after="40"/>
+      </w:pPr>
+      <w:r>
+        <w:t xml:space="preserve"> </w:t>
+      </w:r>
+    </w:p>
+    <w:p>
+      <w:pPr>
+        <w:spacing w:after="40"/>
+      </w:pPr>
+      <w:r>
         <w:t xml:space="preserve">✍️ CAPTE CADA VIAGEM</w:t>
       </w:r>
     </w:p>
@@ -3750,6 +4046,14 @@
       </w:pPr>
       <w:r>
         <w:t xml:space="preserve">🎬 Até 3 vídeos (15 s) por entrada</w:t>
+      </w:r>
+    </w:p>
+    <w:p>
+      <w:pPr>
+        <w:spacing w:after="40"/>
+      </w:pPr>
+      <w:r>
+        <w:t xml:space="preserve">🎞️ Reels de aventuras — viagens em vídeos para partilhar</w:t>
       </w:r>
     </w:p>
     <w:p>
@@ -3860,15 +4164,15 @@
           <w:sz w:val="20"/>
           <w:szCs w:val="20"/>
         </w:rPr>
-        <w:t xml:space="preserve">SHORT DESCRIPTION (66/80)</w:t>
-      </w:r>
-    </w:p>
-    <w:p>
-      <w:pPr>
-        <w:spacing w:after="40"/>
-      </w:pPr>
-      <w:r>
-        <w:t xml:space="preserve">Privat resedagbok: foton, videor, karta &amp; molnsynk. Inga annonser.</w:t>
+        <w:t xml:space="preserve">SHORT DESCRIPTION (61/80)</w:t>
+      </w:r>
+    </w:p>
+    <w:p>
+      <w:pPr>
+        <w:spacing w:after="40"/>
+      </w:pPr>
+      <w:r>
+        <w:t xml:space="preserve">Privat resedagbok: foton, videor, karta, molnsynk och applås.</w:t>
       </w:r>
     </w:p>
     <w:p>
@@ -3883,7 +4187,7 @@
           <w:sz w:val="20"/>
           <w:szCs w:val="20"/>
         </w:rPr>
-        <w:t xml:space="preserve">FULL DESCRIPTION (2382/4000)</w:t>
+        <w:t xml:space="preserve">FULL DESCRIPTION (2687/4000)</w:t>
       </w:r>
     </w:p>
     <w:p>
@@ -3963,6 +4267,30 @@
         <w:spacing w:after="40"/>
       </w:pPr>
       <w:r>
+        <w:t xml:space="preserve">🎞️ ÄVENTYRSREELEN</w:t>
+      </w:r>
+    </w:p>
+    <w:p>
+      <w:pPr>
+        <w:spacing w:after="40"/>
+      </w:pPr>
+      <w:r>
+        <w:t xml:space="preserve">Förvandla vilken resa som helst till en delbar minifilm. Ett tryck skapar ett vackert vertikalt bildspel av dina resefoton — mjuka panoreringar, eleganta övergångar, plats och datum i bild — redo för WhatsApp, Instagram eller familjechatten.</w:t>
+      </w:r>
+    </w:p>
+    <w:p>
+      <w:pPr>
+        <w:spacing w:after="40"/>
+      </w:pPr>
+      <w:r>
+        <w:t xml:space="preserve"> </w:t>
+      </w:r>
+    </w:p>
+    <w:p>
+      <w:pPr>
+        <w:spacing w:after="40"/>
+      </w:pPr>
+      <w:r>
         <w:t xml:space="preserve">✍️ FÅNGA VARJE RESA</w:t>
       </w:r>
     </w:p>
@@ -4164,6 +4492,14 @@
       </w:pPr>
       <w:r>
         <w:t xml:space="preserve">🎬 Upp till 3 videor (15 s) per inlägg</w:t>
+      </w:r>
+    </w:p>
+    <w:p>
+      <w:pPr>
+        <w:spacing w:after="40"/>
+      </w:pPr>
+      <w:r>
+        <w:t xml:space="preserve">🎞️ Äventyrsreels — resor som delbara videor</w:t>
       </w:r>
     </w:p>
     <w:p>
@@ -4274,15 +4610,15 @@
           <w:sz w:val="20"/>
           <w:szCs w:val="20"/>
         </w:rPr>
-        <w:t xml:space="preserve">SHORT DESCRIPTION (28/80)</w:t>
-      </w:r>
-    </w:p>
-    <w:p>
-      <w:pPr>
-        <w:spacing w:after="40"/>
-      </w:pPr>
-      <w:r>
-        <w:t xml:space="preserve">私密旅行日记：照片、视频、地图、云同步。无广告，不追踪。</w:t>
+        <w:t xml:space="preserve">SHORT DESCRIPTION (24/80)</w:t>
+      </w:r>
+    </w:p>
+    <w:p>
+      <w:pPr>
+        <w:spacing w:after="40"/>
+      </w:pPr>
+      <w:r>
+        <w:t xml:space="preserve">私密旅行日记：照片、视频、地图、云同步与应用锁。</w:t>
       </w:r>
     </w:p>
     <w:p>
@@ -4297,7 +4633,7 @@
           <w:sz w:val="20"/>
           <w:szCs w:val="20"/>
         </w:rPr>
-        <w:t xml:space="preserve">FULL DESCRIPTION (907/4000)</w:t>
+        <w:t xml:space="preserve">FULL DESCRIPTION (1032/4000)</w:t>
       </w:r>
     </w:p>
     <w:p>
@@ -4377,6 +4713,30 @@
         <w:spacing w:after="40"/>
       </w:pPr>
       <w:r>
+        <w:t xml:space="preserve">🎞️ 冒险短片</w:t>
+      </w:r>
+    </w:p>
+    <w:p>
+      <w:pPr>
+        <w:spacing w:after="40"/>
+      </w:pPr>
+      <w:r>
+        <w:t xml:space="preserve">把任何一次旅行变成可分享的迷你影片。轻点一下，即可用旅行照片生成精美的竖屏幻灯片——平滑的镜头推移、优雅的转场、地点和日期叠加——随时分享到微信、WhatsApp 或 Instagram。</w:t>
+      </w:r>
+    </w:p>
+    <w:p>
+      <w:pPr>
+        <w:spacing w:after="40"/>
+      </w:pPr>
+      <w:r>
+        <w:t xml:space="preserve"> </w:t>
+      </w:r>
+    </w:p>
+    <w:p>
+      <w:pPr>
+        <w:spacing w:after="40"/>
+      </w:pPr>
+      <w:r>
         <w:t xml:space="preserve">✍️ 记录每一次旅程</w:t>
       </w:r>
     </w:p>
@@ -4578,6 +4938,14 @@
       </w:pPr>
       <w:r>
         <w:t xml:space="preserve">🎬 每篇日记最多 3 段视频（15 秒）</w:t>
+      </w:r>
+    </w:p>
+    <w:p>
+      <w:pPr>
+        <w:spacing w:after="40"/>
+      </w:pPr>
+      <w:r>
+        <w:t xml:space="preserve">🎞️ 冒险短片——把旅行变成可分享的视频</w:t>
       </w:r>
     </w:p>
     <w:p>

</xml_diff>